<commit_message>
[BT_Audio][Upgrade] Upgrage to v1.5.0 from NXP Stan
1. Support A2DP
2. Add audio path for A2DP
</commit_message>
<xml_diff>
--- a/BT_Audio_with_full_audio_path/Rt685Conversa_handsfree_cm33/doc/DevRecord.docx
+++ b/BT_Audio_with_full_audio_path/Rt685Conversa_handsfree_cm33/doc/DevRecord.docx
@@ -2,7 +2,13 @@
 <file path=word/document.xml><?xml version="1.0" encoding="utf-8"?>
 <w:document xmlns:wpc="http://schemas.microsoft.com/office/word/2010/wordprocessingCanvas" xmlns:mc="http://schemas.openxmlformats.org/markup-compatibility/2006" xmlns:o="urn:schemas-microsoft-com:office:office" xmlns:r="http://schemas.openxmlformats.org/officeDocument/2006/relationships" xmlns:m="http://schemas.openxmlformats.org/officeDocument/2006/math" xmlns:v="urn:schemas-microsoft-com:vml" xmlns:wp14="http://schemas.microsoft.com/office/word/2010/wordprocessingDrawing" xmlns:wp="http://schemas.openxmlformats.org/drawingml/2006/wordprocessingDrawing" xmlns:w10="urn:schemas-microsoft-com:office:word" xmlns:w="http://schemas.openxmlformats.org/wordprocessingml/2006/main" xmlns:w14="http://schemas.microsoft.com/office/word/2010/wordml" xmlns:wpg="http://schemas.microsoft.com/office/word/2010/wordprocessingGroup" xmlns:wpi="http://schemas.microsoft.com/office/word/2010/wordprocessingInk" xmlns:wne="http://schemas.microsoft.com/office/word/2006/wordml" xmlns:wps="http://schemas.microsoft.com/office/word/2010/wordprocessingShape" mc:Ignorable="w14 wp14">
   <w:body>
-    <w:p/>
+    <w:p>
+      <w:pPr>
+        <w:rPr>
+          <w:rFonts w:hint="eastAsia"/>
+        </w:rPr>
+      </w:pPr>
+    </w:p>
     <w:p/>
     <w:p>
       <w:r>
@@ -1247,15 +1253,1870 @@
           </wp:inline>
         </w:drawing>
       </w:r>
+    </w:p>
+    <w:p/>
+    <w:p>
+      <w:pPr>
+        <w:rPr>
+          <w:b/>
+          <w:u w:val="single"/>
+        </w:rPr>
+      </w:pPr>
+      <w:r>
+        <w:rPr>
+          <w:b/>
+          <w:u w:val="single"/>
+        </w:rPr>
+        <w:t>AudioPortI2SAndPdmCfg:</w:t>
+      </w:r>
+    </w:p>
+    <w:p>
+      <w:proofErr w:type="gramStart"/>
+      <w:r>
+        <w:t>bit</w:t>
+      </w:r>
+      <w:proofErr w:type="gramEnd"/>
+      <w:r>
+        <w:t xml:space="preserve"> 0~1: </w:t>
+      </w:r>
+      <w:r>
+        <w:rPr>
+          <w:rFonts w:hint="eastAsia"/>
+        </w:rPr>
+        <w:tab/>
+      </w:r>
+      <w:r>
+        <w:tab/>
+        <w:t xml:space="preserve">I2S_Amp </w:t>
+      </w:r>
+      <w:proofErr w:type="spellStart"/>
+      <w:r>
+        <w:t>Fs</w:t>
+      </w:r>
+      <w:proofErr w:type="spellEnd"/>
+      <w:r>
+        <w:t>: 0,1,2,3 -&gt; 16K, 32K, 44.1K, 48K</w:t>
+      </w:r>
+    </w:p>
+    <w:p>
+      <w:proofErr w:type="gramStart"/>
+      <w:r>
+        <w:t>bit</w:t>
+      </w:r>
+      <w:proofErr w:type="gramEnd"/>
+      <w:r>
+        <w:t xml:space="preserve"> 2~3: </w:t>
+      </w:r>
+      <w:r>
+        <w:rPr>
+          <w:rFonts w:hint="eastAsia"/>
+        </w:rPr>
+        <w:tab/>
+      </w:r>
+      <w:r>
+        <w:tab/>
+        <w:t>I2S_Amp Bit: 0,1,2 -&gt; disabled, 16, 32bit</w:t>
+      </w:r>
+    </w:p>
+    <w:p/>
+    <w:p>
+      <w:proofErr w:type="gramStart"/>
+      <w:r>
+        <w:t>bit</w:t>
+      </w:r>
+      <w:proofErr w:type="gramEnd"/>
+      <w:r>
+        <w:t xml:space="preserve"> 4~5:  </w:t>
+      </w:r>
+      <w:r>
+        <w:tab/>
+        <w:t xml:space="preserve">I2S_Nvt </w:t>
+      </w:r>
+      <w:proofErr w:type="spellStart"/>
+      <w:r>
+        <w:t>Fs</w:t>
+      </w:r>
+      <w:proofErr w:type="spellEnd"/>
+      <w:r>
+        <w:t>: 0,1,2,3 -&gt; 16K, 32K, 44.1K, 48K</w:t>
+      </w:r>
+    </w:p>
+    <w:p>
+      <w:proofErr w:type="gramStart"/>
+      <w:r>
+        <w:t>bit</w:t>
+      </w:r>
+      <w:proofErr w:type="gramEnd"/>
+      <w:r>
+        <w:t xml:space="preserve"> 6~7:  </w:t>
+      </w:r>
+      <w:r>
+        <w:tab/>
+        <w:t>I2S_Nvt Bit: 0,1,2 -&gt; disabled, 16, 32bit</w:t>
+      </w:r>
+    </w:p>
+    <w:p/>
+    <w:p>
+      <w:proofErr w:type="gramStart"/>
+      <w:r>
+        <w:t>bit</w:t>
+      </w:r>
+      <w:proofErr w:type="gramEnd"/>
+      <w:r>
+        <w:t xml:space="preserve"> 8~9:   </w:t>
+      </w:r>
+      <w:r>
+        <w:rPr>
+          <w:rFonts w:hint="eastAsia"/>
+        </w:rPr>
+        <w:tab/>
+      </w:r>
+      <w:r>
+        <w:t xml:space="preserve">PDM </w:t>
+      </w:r>
+      <w:proofErr w:type="spellStart"/>
+      <w:r>
+        <w:t>Fs</w:t>
+      </w:r>
+      <w:proofErr w:type="spellEnd"/>
+      <w:r>
+        <w:t>: 0,1,2,3 -&gt; 16K, 32K, 44.1K, 48K</w:t>
+      </w:r>
+    </w:p>
+    <w:p>
+      <w:proofErr w:type="gramStart"/>
+      <w:r>
+        <w:t>bit</w:t>
+      </w:r>
+      <w:proofErr w:type="gramEnd"/>
+      <w:r>
+        <w:t xml:space="preserve"> 10~15:  </w:t>
+      </w:r>
+      <w:r>
+        <w:rPr>
+          <w:rFonts w:hint="eastAsia"/>
+        </w:rPr>
+        <w:tab/>
+      </w:r>
+      <w:r>
+        <w:t xml:space="preserve">PDM </w:t>
+      </w:r>
+      <w:proofErr w:type="spellStart"/>
+      <w:r>
+        <w:t>ch</w:t>
+      </w:r>
+      <w:proofErr w:type="spellEnd"/>
+      <w:r>
+        <w:t xml:space="preserve"> enable</w:t>
+      </w:r>
+    </w:p>
+    <w:p/>
+    <w:p/>
+    <w:p>
+      <w:r>
+        <w:t>Call</w:t>
+      </w:r>
+      <w:r>
+        <w:rPr>
+          <w:rFonts w:hint="eastAsia"/>
+        </w:rPr>
+        <w:t xml:space="preserve"> type:</w:t>
+      </w:r>
+    </w:p>
+    <w:p/>
+    <w:p>
+      <w:proofErr w:type="spellStart"/>
+      <w:r>
+        <w:rPr>
+          <w:rFonts w:hint="eastAsia"/>
+        </w:rPr>
+        <w:t>HfpAppCall</w:t>
+      </w:r>
+      <w:proofErr w:type="spellEnd"/>
+    </w:p>
+    <w:p>
+      <w:r>
+        <w:rPr>
+          <w:rFonts w:hint="eastAsia"/>
+        </w:rPr>
+        <w:tab/>
+      </w:r>
+      <w:r>
+        <w:t>C</w:t>
+      </w:r>
+      <w:r>
+        <w:rPr>
+          <w:rFonts w:hint="eastAsia"/>
+        </w:rPr>
+        <w:t xml:space="preserve">all out </w:t>
+      </w:r>
+      <w:proofErr w:type="gramStart"/>
+      <w:r>
+        <w:rPr>
+          <w:rFonts w:hint="eastAsia"/>
+        </w:rPr>
+        <w:t>---  not</w:t>
+      </w:r>
+      <w:proofErr w:type="gramEnd"/>
+      <w:r>
+        <w:rPr>
+          <w:rFonts w:hint="eastAsia"/>
+        </w:rPr>
+        <w:t xml:space="preserve"> answered</w:t>
+      </w:r>
+    </w:p>
+    <w:p>
+      <w:r>
+        <w:rPr>
+          <w:rFonts w:hint="eastAsia"/>
+        </w:rPr>
+        <w:tab/>
+      </w:r>
+      <w:r>
+        <w:t>C</w:t>
+      </w:r>
+      <w:r>
+        <w:rPr>
+          <w:rFonts w:hint="eastAsia"/>
+        </w:rPr>
+        <w:t xml:space="preserve">all out </w:t>
+      </w:r>
+      <w:proofErr w:type="gramStart"/>
+      <w:r>
+        <w:rPr>
+          <w:rFonts w:hint="eastAsia"/>
+        </w:rPr>
+        <w:t>---  answered</w:t>
+      </w:r>
+      <w:proofErr w:type="gramEnd"/>
+    </w:p>
+    <w:p>
+      <w:r>
+        <w:rPr>
+          <w:rFonts w:hint="eastAsia"/>
+        </w:rPr>
+        <w:tab/>
+      </w:r>
+      <w:r>
+        <w:t>C</w:t>
+      </w:r>
+      <w:r>
+        <w:rPr>
+          <w:rFonts w:hint="eastAsia"/>
+        </w:rPr>
+        <w:t xml:space="preserve">all in </w:t>
+      </w:r>
+      <w:proofErr w:type="gramStart"/>
+      <w:r>
+        <w:rPr>
+          <w:rFonts w:hint="eastAsia"/>
+        </w:rPr>
+        <w:t>---  not</w:t>
+      </w:r>
+      <w:proofErr w:type="gramEnd"/>
+      <w:r>
+        <w:rPr>
+          <w:rFonts w:hint="eastAsia"/>
+        </w:rPr>
+        <w:t xml:space="preserve"> answered</w:t>
+      </w:r>
+    </w:p>
+    <w:p>
+      <w:r>
+        <w:rPr>
+          <w:rFonts w:hint="eastAsia"/>
+        </w:rPr>
+        <w:tab/>
+      </w:r>
+      <w:r>
+        <w:t>C</w:t>
+      </w:r>
+      <w:r>
+        <w:rPr>
+          <w:rFonts w:hint="eastAsia"/>
+        </w:rPr>
+        <w:t xml:space="preserve">all in </w:t>
+      </w:r>
+      <w:proofErr w:type="gramStart"/>
+      <w:r>
+        <w:rPr>
+          <w:rFonts w:hint="eastAsia"/>
+        </w:rPr>
+        <w:t>---  answered</w:t>
+      </w:r>
+      <w:proofErr w:type="gramEnd"/>
+    </w:p>
+    <w:p>
+      <w:proofErr w:type="spellStart"/>
+      <w:r>
+        <w:rPr>
+          <w:rFonts w:hint="eastAsia"/>
+        </w:rPr>
+        <w:t>HfpTelCall</w:t>
+      </w:r>
+      <w:proofErr w:type="spellEnd"/>
+    </w:p>
+    <w:p>
+      <w:r>
+        <w:rPr>
+          <w:rFonts w:hint="eastAsia"/>
+        </w:rPr>
+        <w:tab/>
+      </w:r>
+      <w:r>
+        <w:t>C</w:t>
+      </w:r>
+      <w:r>
+        <w:rPr>
+          <w:rFonts w:hint="eastAsia"/>
+        </w:rPr>
+        <w:t xml:space="preserve">all out </w:t>
+      </w:r>
+      <w:proofErr w:type="gramStart"/>
+      <w:r>
+        <w:rPr>
+          <w:rFonts w:hint="eastAsia"/>
+        </w:rPr>
+        <w:t>---  not</w:t>
+      </w:r>
+      <w:proofErr w:type="gramEnd"/>
+      <w:r>
+        <w:rPr>
+          <w:rFonts w:hint="eastAsia"/>
+        </w:rPr>
+        <w:t xml:space="preserve"> answered</w:t>
+      </w:r>
+    </w:p>
+    <w:p>
+      <w:r>
+        <w:rPr>
+          <w:rFonts w:hint="eastAsia"/>
+        </w:rPr>
+        <w:tab/>
+      </w:r>
+      <w:r>
+        <w:t>C</w:t>
+      </w:r>
+      <w:r>
+        <w:rPr>
+          <w:rFonts w:hint="eastAsia"/>
+        </w:rPr>
+        <w:t xml:space="preserve">all out </w:t>
+      </w:r>
+      <w:proofErr w:type="gramStart"/>
+      <w:r>
+        <w:rPr>
+          <w:rFonts w:hint="eastAsia"/>
+        </w:rPr>
+        <w:t>---  answered</w:t>
+      </w:r>
+      <w:proofErr w:type="gramEnd"/>
+    </w:p>
+    <w:p>
+      <w:r>
+        <w:rPr>
+          <w:rFonts w:hint="eastAsia"/>
+        </w:rPr>
+        <w:tab/>
+      </w:r>
+      <w:r>
+        <w:t>C</w:t>
+      </w:r>
+      <w:r>
+        <w:rPr>
+          <w:rFonts w:hint="eastAsia"/>
+        </w:rPr>
+        <w:t xml:space="preserve">all in </w:t>
+      </w:r>
+      <w:proofErr w:type="gramStart"/>
+      <w:r>
+        <w:rPr>
+          <w:rFonts w:hint="eastAsia"/>
+        </w:rPr>
+        <w:t>---  not</w:t>
+      </w:r>
+      <w:proofErr w:type="gramEnd"/>
+      <w:r>
+        <w:rPr>
+          <w:rFonts w:hint="eastAsia"/>
+        </w:rPr>
+        <w:t xml:space="preserve"> answered</w:t>
+      </w:r>
+    </w:p>
+    <w:p>
+      <w:r>
+        <w:rPr>
+          <w:rFonts w:hint="eastAsia"/>
+        </w:rPr>
+        <w:tab/>
+      </w:r>
+      <w:r>
+        <w:t>C</w:t>
+      </w:r>
+      <w:r>
+        <w:rPr>
+          <w:rFonts w:hint="eastAsia"/>
+        </w:rPr>
+        <w:t xml:space="preserve">all in </w:t>
+      </w:r>
+      <w:proofErr w:type="gramStart"/>
+      <w:r>
+        <w:rPr>
+          <w:rFonts w:hint="eastAsia"/>
+        </w:rPr>
+        <w:t>---  answered</w:t>
+      </w:r>
+      <w:proofErr w:type="gramEnd"/>
+    </w:p>
+    <w:p/>
+    <w:p/>
+    <w:p/>
+    <w:p>
+      <w:r>
+        <w:rPr>
+          <w:rFonts w:hint="eastAsia"/>
+        </w:rPr>
+        <w:t xml:space="preserve">A2dp play streaming: </w:t>
+      </w:r>
+      <w:proofErr w:type="spellStart"/>
+      <w:r>
+        <w:rPr>
+          <w:rFonts w:hint="eastAsia"/>
+        </w:rPr>
+        <w:t>sbc</w:t>
+      </w:r>
+      <w:proofErr w:type="spellEnd"/>
+      <w:r>
+        <w:rPr>
+          <w:rFonts w:hint="eastAsia"/>
+        </w:rPr>
+        <w:t xml:space="preserve"> frame 528, 20ms, seems to be always </w:t>
+      </w:r>
+      <w:proofErr w:type="gramStart"/>
+      <w:r>
+        <w:rPr>
+          <w:rFonts w:hint="eastAsia"/>
+        </w:rPr>
+        <w:t>44100KHz</w:t>
+      </w:r>
+      <w:proofErr w:type="gramEnd"/>
+      <w:r>
+        <w:rPr>
+          <w:rFonts w:hint="eastAsia"/>
+        </w:rPr>
+        <w:t xml:space="preserve">, but support </w:t>
+      </w:r>
+    </w:p>
+    <w:p>
+      <w:pPr>
+        <w:widowControl/>
+        <w:shd w:val="clear" w:color="auto" w:fill="FFFFFF"/>
+        <w:jc w:val="left"/>
+        <w:rPr>
+          <w:rFonts w:ascii="Consolas" w:eastAsia="宋体" w:hAnsi="Consolas" w:cs="宋体"/>
+          <w:color w:val="000000"/>
+          <w:kern w:val="0"/>
+          <w:sz w:val="20"/>
+          <w:szCs w:val="20"/>
+        </w:rPr>
+      </w:pPr>
+      <w:r>
+        <w:rPr>
+          <w:rFonts w:ascii="Consolas" w:eastAsia="宋体" w:hAnsi="Consolas" w:cs="宋体"/>
+          <w:b/>
+          <w:bCs/>
+          <w:color w:val="7F0055"/>
+          <w:kern w:val="0"/>
+          <w:sz w:val="20"/>
+          <w:szCs w:val="20"/>
+        </w:rPr>
+        <w:t>#define</w:t>
+      </w:r>
+      <w:r>
+        <w:rPr>
+          <w:rFonts w:ascii="Consolas" w:eastAsia="宋体" w:hAnsi="Consolas" w:cs="宋体"/>
+          <w:color w:val="000000"/>
+          <w:kern w:val="0"/>
+          <w:sz w:val="20"/>
+          <w:szCs w:val="20"/>
+        </w:rPr>
+        <w:t xml:space="preserve"> SBC_SAMPLING_FREQ_16000           0</w:t>
+      </w:r>
+    </w:p>
+    <w:p>
+      <w:pPr>
+        <w:widowControl/>
+        <w:shd w:val="clear" w:color="auto" w:fill="FFFFFF"/>
+        <w:jc w:val="left"/>
+        <w:rPr>
+          <w:rFonts w:ascii="Consolas" w:eastAsia="宋体" w:hAnsi="Consolas" w:cs="宋体"/>
+          <w:color w:val="000000"/>
+          <w:kern w:val="0"/>
+          <w:sz w:val="20"/>
+          <w:szCs w:val="20"/>
+        </w:rPr>
+      </w:pPr>
+      <w:r>
+        <w:rPr>
+          <w:rFonts w:ascii="Consolas" w:eastAsia="宋体" w:hAnsi="Consolas" w:cs="宋体"/>
+          <w:b/>
+          <w:bCs/>
+          <w:color w:val="7F0055"/>
+          <w:kern w:val="0"/>
+          <w:sz w:val="20"/>
+          <w:szCs w:val="20"/>
+        </w:rPr>
+        <w:t>#define</w:t>
+      </w:r>
+      <w:r>
+        <w:rPr>
+          <w:rFonts w:ascii="Consolas" w:eastAsia="宋体" w:hAnsi="Consolas" w:cs="宋体"/>
+          <w:color w:val="000000"/>
+          <w:kern w:val="0"/>
+          <w:sz w:val="20"/>
+          <w:szCs w:val="20"/>
+        </w:rPr>
+        <w:t xml:space="preserve"> SBC_SAMPLING_FREQ_32000           1</w:t>
+      </w:r>
+    </w:p>
+    <w:p>
+      <w:pPr>
+        <w:widowControl/>
+        <w:shd w:val="clear" w:color="auto" w:fill="FFFFFF"/>
+        <w:jc w:val="left"/>
+        <w:rPr>
+          <w:rFonts w:ascii="Consolas" w:eastAsia="宋体" w:hAnsi="Consolas" w:cs="宋体"/>
+          <w:color w:val="000000"/>
+          <w:kern w:val="0"/>
+          <w:sz w:val="20"/>
+          <w:szCs w:val="20"/>
+        </w:rPr>
+      </w:pPr>
+      <w:r>
+        <w:rPr>
+          <w:rFonts w:ascii="Consolas" w:eastAsia="宋体" w:hAnsi="Consolas" w:cs="宋体"/>
+          <w:b/>
+          <w:bCs/>
+          <w:color w:val="7F0055"/>
+          <w:kern w:val="0"/>
+          <w:sz w:val="20"/>
+          <w:szCs w:val="20"/>
+        </w:rPr>
+        <w:t>#define</w:t>
+      </w:r>
+      <w:r>
+        <w:rPr>
+          <w:rFonts w:ascii="Consolas" w:eastAsia="宋体" w:hAnsi="Consolas" w:cs="宋体"/>
+          <w:color w:val="000000"/>
+          <w:kern w:val="0"/>
+          <w:sz w:val="20"/>
+          <w:szCs w:val="20"/>
+        </w:rPr>
+        <w:t xml:space="preserve"> </w:t>
+      </w:r>
+      <w:r>
+        <w:rPr>
+          <w:rFonts w:ascii="Consolas" w:eastAsia="宋体" w:hAnsi="Consolas" w:cs="宋体"/>
+          <w:color w:val="000000"/>
+          <w:kern w:val="0"/>
+          <w:sz w:val="20"/>
+          <w:szCs w:val="20"/>
+          <w:shd w:val="clear" w:color="auto" w:fill="D4D4D4"/>
+        </w:rPr>
+        <w:t>SBC_SAMPLING_FREQ_44100</w:t>
+      </w:r>
+      <w:r>
+        <w:rPr>
+          <w:rFonts w:ascii="Consolas" w:eastAsia="宋体" w:hAnsi="Consolas" w:cs="宋体"/>
+          <w:color w:val="000000"/>
+          <w:kern w:val="0"/>
+          <w:sz w:val="20"/>
+          <w:szCs w:val="20"/>
+        </w:rPr>
+        <w:t xml:space="preserve">           2</w:t>
+      </w:r>
+    </w:p>
+    <w:p>
+      <w:pPr>
+        <w:widowControl/>
+        <w:shd w:val="clear" w:color="auto" w:fill="FFFFFF"/>
+        <w:jc w:val="left"/>
+        <w:rPr>
+          <w:rFonts w:ascii="Consolas" w:eastAsia="宋体" w:hAnsi="Consolas" w:cs="宋体"/>
+          <w:color w:val="000000"/>
+          <w:kern w:val="0"/>
+          <w:sz w:val="20"/>
+          <w:szCs w:val="20"/>
+        </w:rPr>
+      </w:pPr>
+      <w:r>
+        <w:rPr>
+          <w:rFonts w:ascii="Consolas" w:eastAsia="宋体" w:hAnsi="Consolas" w:cs="宋体"/>
+          <w:b/>
+          <w:bCs/>
+          <w:color w:val="7F0055"/>
+          <w:kern w:val="0"/>
+          <w:sz w:val="20"/>
+          <w:szCs w:val="20"/>
+        </w:rPr>
+        <w:lastRenderedPageBreak/>
+        <w:t>#define</w:t>
+      </w:r>
+      <w:r>
+        <w:rPr>
+          <w:rFonts w:ascii="Consolas" w:eastAsia="宋体" w:hAnsi="Consolas" w:cs="宋体"/>
+          <w:color w:val="000000"/>
+          <w:kern w:val="0"/>
+          <w:sz w:val="20"/>
+          <w:szCs w:val="20"/>
+        </w:rPr>
+        <w:t xml:space="preserve"> SBC_SAMPLING_FREQ_48000           3</w:t>
+      </w:r>
+    </w:p>
+    <w:p/>
+    <w:p>
+      <w:proofErr w:type="spellStart"/>
+      <w:proofErr w:type="gramStart"/>
+      <w:r>
+        <w:t>OPus</w:t>
+      </w:r>
+      <w:proofErr w:type="spellEnd"/>
+      <w:r>
+        <w:rPr>
+          <w:rFonts w:hint="eastAsia"/>
+        </w:rPr>
+        <w:t xml:space="preserve"> file</w:t>
+      </w:r>
+      <w:proofErr w:type="gramEnd"/>
+      <w:r>
+        <w:rPr>
+          <w:rFonts w:hint="eastAsia"/>
+        </w:rPr>
+        <w:t xml:space="preserve"> decoding:</w:t>
+      </w:r>
+    </w:p>
+    <w:p>
+      <w:r>
+        <w:t>Each time read 4096 byte, but consumed byte number is variable</w:t>
+      </w:r>
+    </w:p>
+    <w:p>
+      <w:r>
+        <w:t>Each time 20ms samples are generated. 20*48 or 20*16 samples (per channel)</w:t>
+      </w:r>
+    </w:p>
+    <w:p>
+      <w:r>
+        <w:tab/>
+      </w:r>
+      <w:proofErr w:type="gramStart"/>
+      <w:r>
+        <w:t>16KHz</w:t>
+      </w:r>
+      <w:proofErr w:type="gramEnd"/>
+      <w:r>
+        <w:t>:</w:t>
+      </w:r>
+      <w:r>
+        <w:tab/>
+        <w:t>output 20*16 samples</w:t>
+      </w:r>
+    </w:p>
+    <w:p>
+      <w:r>
+        <w:tab/>
+      </w:r>
+      <w:proofErr w:type="gramStart"/>
+      <w:r>
+        <w:t>44.1KHz</w:t>
+      </w:r>
+      <w:proofErr w:type="gramEnd"/>
+      <w:r>
+        <w:t>:</w:t>
+      </w:r>
+      <w:r>
+        <w:tab/>
+        <w:t>output 20*44.1 samples</w:t>
+      </w:r>
+    </w:p>
+    <w:p>
+      <w:r>
+        <w:tab/>
+      </w:r>
+      <w:proofErr w:type="gramStart"/>
+      <w:r>
+        <w:t>48KHz</w:t>
+      </w:r>
+      <w:proofErr w:type="gramEnd"/>
+      <w:r>
+        <w:t>:</w:t>
+      </w:r>
+      <w:r>
+        <w:tab/>
+        <w:t>output 20*48 samples</w:t>
+      </w:r>
+    </w:p>
+    <w:p/>
+    <w:p>
+      <w:proofErr w:type="spellStart"/>
+      <w:r>
+        <w:rPr>
+          <w:rFonts w:hint="eastAsia"/>
+        </w:rPr>
+        <w:t>Sbc</w:t>
+      </w:r>
+      <w:proofErr w:type="spellEnd"/>
+      <w:r>
+        <w:rPr>
+          <w:rFonts w:hint="eastAsia"/>
+        </w:rPr>
+        <w:t xml:space="preserve"> file decoding:</w:t>
+      </w:r>
+    </w:p>
+    <w:p>
+      <w:pPr>
+        <w:ind w:firstLine="420"/>
+      </w:pPr>
+      <w:r>
+        <w:t>Each time read variable length byte, but consumed byte number is variable</w:t>
+      </w:r>
+    </w:p>
+    <w:p/>
+    <w:p>
+      <w:r>
+        <w:tab/>
+      </w:r>
+      <w:proofErr w:type="gramStart"/>
+      <w:r>
+        <w:t>16KHz</w:t>
+      </w:r>
+      <w:proofErr w:type="gramEnd"/>
+      <w:r>
+        <w:t>:</w:t>
+      </w:r>
+      <w:r>
+        <w:tab/>
+        <w:t>output 128 samples, from decoding 129 bytes</w:t>
+      </w:r>
+    </w:p>
+    <w:p>
+      <w:r>
+        <w:tab/>
+      </w:r>
+      <w:proofErr w:type="gramStart"/>
+      <w:r>
+        <w:t>44.1KHz</w:t>
+      </w:r>
+      <w:proofErr w:type="gramEnd"/>
+      <w:r>
+        <w:t>:</w:t>
+      </w:r>
+      <w:r>
+        <w:tab/>
+        <w:t>output 128 samples, from decoding 47 bytes</w:t>
+      </w:r>
+    </w:p>
+    <w:p>
+      <w:r>
+        <w:tab/>
+        <w:t>48KHz:</w:t>
+      </w:r>
+      <w:r>
+        <w:tab/>
+        <w:t>output 128 samples, from decoding 43 bytes</w:t>
+      </w:r>
+    </w:p>
+    <w:p/>
+    <w:p>
+      <w:proofErr w:type="spellStart"/>
+      <w:r>
+        <w:rPr>
+          <w:rFonts w:hint="eastAsia"/>
+        </w:rPr>
+        <w:t>Sbc</w:t>
+      </w:r>
+      <w:proofErr w:type="spellEnd"/>
+      <w:r>
+        <w:rPr>
+          <w:rFonts w:hint="eastAsia"/>
+        </w:rPr>
+        <w:t xml:space="preserve"> stream (from BT) decoding:</w:t>
+      </w:r>
+    </w:p>
+    <w:p>
+      <w:pPr>
+        <w:rPr>
+          <w:rFonts w:hint="eastAsia"/>
+        </w:rPr>
+      </w:pPr>
+      <w:r>
+        <w:rPr>
+          <w:rFonts w:hint="eastAsia"/>
+        </w:rPr>
+        <w:tab/>
+      </w:r>
+      <w:proofErr w:type="spellStart"/>
+      <w:r>
+        <w:t>S</w:t>
+      </w:r>
+      <w:r>
+        <w:rPr>
+          <w:rFonts w:hint="eastAsia"/>
+        </w:rPr>
+        <w:t>bc</w:t>
+      </w:r>
+      <w:proofErr w:type="spellEnd"/>
+      <w:r>
+        <w:rPr>
+          <w:rFonts w:hint="eastAsia"/>
+        </w:rPr>
+        <w:t xml:space="preserve"> frame： </w:t>
+      </w:r>
+      <w:proofErr w:type="gramStart"/>
+      <w:r>
+        <w:rPr>
+          <w:rFonts w:hint="eastAsia"/>
+        </w:rPr>
+        <w:t>need</w:t>
+      </w:r>
+      <w:proofErr w:type="gramEnd"/>
+      <w:r>
+        <w:rPr>
+          <w:rFonts w:hint="eastAsia"/>
+        </w:rPr>
+        <w:t xml:space="preserve"> to cut first 13 bytes, frame is mostly 581 bytes, but can be a little less.</w:t>
+      </w:r>
+    </w:p>
+    <w:p>
+      <w:pPr>
+        <w:rPr>
+          <w:rFonts w:hint="eastAsia"/>
+        </w:rPr>
+      </w:pPr>
+    </w:p>
+    <w:p>
+      <w:pPr>
+        <w:rPr>
+          <w:rFonts w:hint="eastAsia"/>
+        </w:rPr>
+      </w:pPr>
+    </w:p>
+    <w:p>
+      <w:pPr>
+        <w:rPr>
+          <w:rFonts w:hint="eastAsia"/>
+        </w:rPr>
+      </w:pPr>
+    </w:p>
+    <w:p>
+      <w:pPr>
+        <w:rPr>
+          <w:rFonts w:hint="eastAsia"/>
+        </w:rPr>
+      </w:pPr>
+      <w:r>
+        <w:rPr>
+          <w:rFonts w:hint="eastAsia"/>
+        </w:rPr>
+        <w:t>Software T</w:t>
+      </w:r>
+      <w:r>
+        <w:t>h</w:t>
+      </w:r>
+      <w:r>
+        <w:rPr>
+          <w:rFonts w:hint="eastAsia"/>
+        </w:rPr>
+        <w:t>reads:</w:t>
+      </w:r>
+    </w:p>
+    <w:p>
+      <w:pPr>
+        <w:rPr>
+          <w:rFonts w:hint="eastAsia"/>
+        </w:rPr>
+      </w:pPr>
+    </w:p>
+    <w:p>
+      <w:pPr>
+        <w:rPr>
+          <w:rFonts w:hint="eastAsia"/>
+        </w:rPr>
+      </w:pPr>
+    </w:p>
+    <w:p>
+      <w:pPr>
+        <w:rPr>
+          <w:rFonts w:hint="eastAsia"/>
+        </w:rPr>
+      </w:pPr>
+      <w:proofErr w:type="spellStart"/>
+      <w:r>
+        <w:rPr>
+          <w:rFonts w:hint="eastAsia"/>
+        </w:rPr>
+        <w:t>Mcu</w:t>
+      </w:r>
+      <w:proofErr w:type="spellEnd"/>
+      <w:r>
+        <w:rPr>
+          <w:rFonts w:hint="eastAsia"/>
+        </w:rPr>
+        <w:t>:</w:t>
+      </w:r>
+    </w:p>
+    <w:p>
+      <w:pPr>
+        <w:rPr>
+          <w:rFonts w:hint="eastAsia"/>
+        </w:rPr>
+      </w:pPr>
+      <w:r>
+        <w:rPr>
+          <w:rFonts w:hint="eastAsia"/>
+        </w:rPr>
+        <w:t xml:space="preserve">Audio DMA </w:t>
+      </w:r>
+      <w:proofErr w:type="spellStart"/>
+      <w:r>
+        <w:rPr>
+          <w:rFonts w:hint="eastAsia"/>
+        </w:rPr>
+        <w:t>intr</w:t>
+      </w:r>
+      <w:proofErr w:type="spellEnd"/>
+      <w:r>
+        <w:rPr>
+          <w:rFonts w:hint="eastAsia"/>
+        </w:rPr>
+        <w:t xml:space="preserve"> </w:t>
+      </w:r>
+      <w:r>
+        <w:sym w:font="Wingdings" w:char="F0E0"/>
+      </w:r>
+      <w:r>
+        <w:rPr>
+          <w:rFonts w:hint="eastAsia"/>
+        </w:rPr>
+        <w:t xml:space="preserve"> </w:t>
+      </w:r>
+      <w:r>
+        <w:rPr>
+          <w:rFonts w:hint="eastAsia"/>
+        </w:rPr>
+        <w:t xml:space="preserve">trigger </w:t>
+      </w:r>
+      <w:proofErr w:type="spellStart"/>
+      <w:r>
+        <w:t>Task_</w:t>
+      </w:r>
+      <w:r>
+        <w:rPr>
+          <w:rFonts w:hint="eastAsia"/>
+        </w:rPr>
+        <w:t>Mcu</w:t>
+      </w:r>
+      <w:r>
+        <w:t>AudioFrameProc</w:t>
+      </w:r>
+      <w:proofErr w:type="spellEnd"/>
+      <w:r>
+        <w:rPr>
+          <w:rFonts w:hint="eastAsia"/>
+        </w:rPr>
+        <w:t xml:space="preserve"> </w:t>
+      </w:r>
+      <w:r>
+        <w:sym w:font="Wingdings" w:char="F0E0"/>
+      </w:r>
+      <w:r>
+        <w:rPr>
+          <w:rFonts w:hint="eastAsia"/>
+        </w:rPr>
+        <w:t xml:space="preserve"> trigger DSP MU</w:t>
+      </w:r>
+    </w:p>
+    <w:p>
+      <w:pPr>
+        <w:rPr>
+          <w:rFonts w:hint="eastAsia"/>
+        </w:rPr>
+      </w:pPr>
+      <w:r>
+        <w:t>Manager_Task</w:t>
+      </w:r>
       <w:bookmarkStart w:id="0" w:name="_GoBack"/>
       <w:bookmarkEnd w:id="0"/>
     </w:p>
-    <w:p/>
-    <w:p/>
-    <w:p/>
-    <w:p/>
-    <w:p/>
-    <w:p/>
+    <w:p>
+      <w:pPr>
+        <w:rPr>
+          <w:rFonts w:hint="eastAsia"/>
+        </w:rPr>
+      </w:pPr>
+    </w:p>
+    <w:p>
+      <w:pPr>
+        <w:rPr>
+          <w:rFonts w:hint="eastAsia"/>
+        </w:rPr>
+      </w:pPr>
+    </w:p>
+    <w:p>
+      <w:pPr>
+        <w:rPr>
+          <w:rFonts w:hint="eastAsia"/>
+        </w:rPr>
+      </w:pPr>
+      <w:proofErr w:type="spellStart"/>
+      <w:r>
+        <w:rPr>
+          <w:rFonts w:hint="eastAsia"/>
+        </w:rPr>
+        <w:t>Dsp</w:t>
+      </w:r>
+      <w:proofErr w:type="spellEnd"/>
+      <w:r>
+        <w:rPr>
+          <w:rFonts w:hint="eastAsia"/>
+        </w:rPr>
+        <w:t>:</w:t>
+      </w:r>
+    </w:p>
+    <w:p>
+      <w:pPr>
+        <w:rPr>
+          <w:rFonts w:hint="eastAsia"/>
+        </w:rPr>
+      </w:pPr>
+      <w:r>
+        <w:rPr>
+          <w:rFonts w:hint="eastAsia"/>
+        </w:rPr>
+        <w:t xml:space="preserve">MU </w:t>
+      </w:r>
+      <w:r>
+        <w:t>interrupt</w:t>
+      </w:r>
+      <w:r>
+        <w:rPr>
+          <w:rFonts w:hint="eastAsia"/>
+        </w:rPr>
+        <w:t xml:space="preserve"> </w:t>
+      </w:r>
+      <w:r>
+        <w:sym w:font="Wingdings" w:char="F0E0"/>
+      </w:r>
+      <w:r>
+        <w:rPr>
+          <w:rFonts w:hint="eastAsia"/>
+        </w:rPr>
+        <w:t xml:space="preserve"> trigger </w:t>
+      </w:r>
+      <w:proofErr w:type="spellStart"/>
+      <w:r>
+        <w:t>Task_</w:t>
+      </w:r>
+      <w:r>
+        <w:rPr>
+          <w:rFonts w:hint="eastAsia"/>
+        </w:rPr>
+        <w:t>Dsp</w:t>
+      </w:r>
+      <w:r>
+        <w:t>AudioFrameProc</w:t>
+      </w:r>
+      <w:proofErr w:type="spellEnd"/>
+      <w:r>
+        <w:rPr>
+          <w:rFonts w:hint="eastAsia"/>
+        </w:rPr>
+        <w:t xml:space="preserve"> </w:t>
+      </w:r>
+      <w:r>
+        <w:sym w:font="Wingdings" w:char="F0E0"/>
+      </w:r>
+      <w:r>
+        <w:rPr>
+          <w:rFonts w:hint="eastAsia"/>
+        </w:rPr>
+        <w:t xml:space="preserve"> trigger </w:t>
+      </w:r>
+      <w:proofErr w:type="spellStart"/>
+      <w:r>
+        <w:t>Task_VitAndAudioDec</w:t>
+      </w:r>
+      <w:proofErr w:type="spellEnd"/>
+      <w:r>
+        <w:rPr>
+          <w:rFonts w:hint="eastAsia"/>
+        </w:rPr>
+        <w:tab/>
+      </w:r>
+      <w:r>
+        <w:sym w:font="Wingdings" w:char="F0E0"/>
+      </w:r>
+      <w:r>
+        <w:rPr>
+          <w:rFonts w:hint="eastAsia"/>
+        </w:rPr>
+        <w:tab/>
+        <w:t xml:space="preserve">trigger </w:t>
+      </w:r>
+      <w:proofErr w:type="spellStart"/>
+      <w:r>
+        <w:rPr>
+          <w:rFonts w:hint="eastAsia"/>
+        </w:rPr>
+        <w:t>Mcu</w:t>
+      </w:r>
+      <w:proofErr w:type="spellEnd"/>
+      <w:r>
+        <w:rPr>
+          <w:rFonts w:hint="eastAsia"/>
+        </w:rPr>
+        <w:t xml:space="preserve"> MU</w:t>
+      </w:r>
+    </w:p>
+    <w:p>
+      <w:pPr>
+        <w:rPr>
+          <w:rFonts w:hint="eastAsia"/>
+        </w:rPr>
+      </w:pPr>
+      <w:r>
+        <w:rPr>
+          <w:rFonts w:hint="eastAsia"/>
+        </w:rPr>
+        <w:tab/>
+      </w:r>
+      <w:r>
+        <w:rPr>
+          <w:rFonts w:hint="eastAsia"/>
+        </w:rPr>
+        <w:tab/>
+      </w:r>
+      <w:r>
+        <w:rPr>
+          <w:rFonts w:hint="eastAsia"/>
+        </w:rPr>
+        <w:tab/>
+      </w:r>
+      <w:r>
+        <w:rPr>
+          <w:rFonts w:hint="eastAsia"/>
+        </w:rPr>
+        <w:tab/>
+      </w:r>
+      <w:r>
+        <w:rPr>
+          <w:rFonts w:hint="eastAsia"/>
+        </w:rPr>
+        <w:tab/>
+      </w:r>
+      <w:r>
+        <w:rPr>
+          <w:rFonts w:hint="eastAsia"/>
+        </w:rPr>
+        <w:tab/>
+      </w:r>
+      <w:r>
+        <w:rPr>
+          <w:rFonts w:hint="eastAsia"/>
+        </w:rPr>
+        <w:tab/>
+      </w:r>
+      <w:r>
+        <w:rPr>
+          <w:rFonts w:hint="eastAsia"/>
+        </w:rPr>
+        <w:tab/>
+      </w:r>
+      <w:r>
+        <w:rPr>
+          <w:rFonts w:hint="eastAsia"/>
+        </w:rPr>
+        <w:tab/>
+      </w:r>
+      <w:r>
+        <w:rPr>
+          <w:rFonts w:hint="eastAsia"/>
+        </w:rPr>
+        <w:tab/>
+      </w:r>
+      <w:r>
+        <w:rPr>
+          <w:rFonts w:hint="eastAsia"/>
+        </w:rPr>
+        <w:tab/>
+      </w:r>
+      <w:r>
+        <w:rPr>
+          <w:rFonts w:hint="eastAsia"/>
+        </w:rPr>
+        <w:tab/>
+      </w:r>
+      <w:r>
+        <w:rPr>
+          <w:rFonts w:hint="eastAsia"/>
+        </w:rPr>
+        <w:tab/>
+      </w:r>
+      <w:r>
+        <w:rPr>
+          <w:rFonts w:hint="eastAsia"/>
+        </w:rPr>
+        <w:tab/>
+      </w:r>
+      <w:r>
+        <w:rPr>
+          <w:rFonts w:hint="eastAsia"/>
+        </w:rPr>
+        <w:tab/>
+      </w:r>
+      <w:r>
+        <w:rPr>
+          <w:rFonts w:hint="eastAsia"/>
+        </w:rPr>
+        <w:t>|</w:t>
+      </w:r>
+    </w:p>
+    <w:p>
+      <w:pPr>
+        <w:rPr>
+          <w:rFonts w:hint="eastAsia"/>
+        </w:rPr>
+      </w:pPr>
+      <w:r>
+        <w:rPr>
+          <w:rFonts w:hint="eastAsia"/>
+        </w:rPr>
+        <w:tab/>
+      </w:r>
+      <w:r>
+        <w:rPr>
+          <w:rFonts w:hint="eastAsia"/>
+        </w:rPr>
+        <w:tab/>
+      </w:r>
+      <w:r>
+        <w:rPr>
+          <w:rFonts w:hint="eastAsia"/>
+        </w:rPr>
+        <w:tab/>
+      </w:r>
+      <w:r>
+        <w:rPr>
+          <w:rFonts w:hint="eastAsia"/>
+        </w:rPr>
+        <w:tab/>
+      </w:r>
+      <w:r>
+        <w:rPr>
+          <w:rFonts w:hint="eastAsia"/>
+        </w:rPr>
+        <w:tab/>
+      </w:r>
+      <w:r>
+        <w:rPr>
+          <w:rFonts w:hint="eastAsia"/>
+        </w:rPr>
+        <w:tab/>
+      </w:r>
+      <w:r>
+        <w:rPr>
+          <w:rFonts w:hint="eastAsia"/>
+        </w:rPr>
+        <w:tab/>
+      </w:r>
+      <w:r>
+        <w:rPr>
+          <w:rFonts w:hint="eastAsia"/>
+        </w:rPr>
+        <w:tab/>
+      </w:r>
+      <w:r>
+        <w:rPr>
+          <w:rFonts w:hint="eastAsia"/>
+        </w:rPr>
+        <w:tab/>
+      </w:r>
+      <w:r>
+        <w:rPr>
+          <w:rFonts w:hint="eastAsia"/>
+        </w:rPr>
+        <w:tab/>
+      </w:r>
+      <w:r>
+        <w:rPr>
+          <w:rFonts w:hint="eastAsia"/>
+        </w:rPr>
+        <w:tab/>
+      </w:r>
+      <w:r>
+        <w:rPr>
+          <w:rFonts w:hint="eastAsia"/>
+        </w:rPr>
+        <w:tab/>
+      </w:r>
+      <w:r>
+        <w:rPr>
+          <w:rFonts w:hint="eastAsia"/>
+        </w:rPr>
+        <w:tab/>
+      </w:r>
+      <w:r>
+        <w:rPr>
+          <w:rFonts w:hint="eastAsia"/>
+        </w:rPr>
+        <w:tab/>
+      </w:r>
+      <w:r>
+        <w:rPr>
+          <w:rFonts w:hint="eastAsia"/>
+        </w:rPr>
+        <w:tab/>
+      </w:r>
+      <w:r>
+        <w:sym w:font="Wingdings" w:char="F0E0"/>
+      </w:r>
+      <w:r>
+        <w:rPr>
+          <w:rFonts w:hint="eastAsia"/>
+        </w:rPr>
+        <w:t xml:space="preserve"> </w:t>
+      </w:r>
+      <w:proofErr w:type="gramStart"/>
+      <w:r>
+        <w:rPr>
+          <w:rFonts w:hint="eastAsia"/>
+        </w:rPr>
+        <w:t>trigger</w:t>
+      </w:r>
+      <w:proofErr w:type="gramEnd"/>
+      <w:r>
+        <w:rPr>
+          <w:rFonts w:hint="eastAsia"/>
+        </w:rPr>
+        <w:t xml:space="preserve"> </w:t>
+      </w:r>
+      <w:proofErr w:type="spellStart"/>
+      <w:r>
+        <w:t>Task_AlgoContainerProc</w:t>
+      </w:r>
+      <w:proofErr w:type="spellEnd"/>
+    </w:p>
+    <w:p>
+      <w:pPr>
+        <w:rPr>
+          <w:rFonts w:hint="eastAsia"/>
+        </w:rPr>
+      </w:pPr>
+    </w:p>
+    <w:p/>
+    <w:p>
+      <w:pPr>
+        <w:rPr>
+          <w:rFonts w:hint="eastAsia"/>
+        </w:rPr>
+      </w:pPr>
+      <w:r>
+        <w:rPr>
+          <w:rFonts w:hint="eastAsia"/>
+        </w:rPr>
+        <w:t xml:space="preserve">MU </w:t>
+      </w:r>
+      <w:r>
+        <w:t>interrupt</w:t>
+      </w:r>
+      <w:r>
+        <w:rPr>
+          <w:rFonts w:hint="eastAsia"/>
+        </w:rPr>
+        <w:t xml:space="preserve"> </w:t>
+      </w:r>
+      <w:r>
+        <w:sym w:font="Wingdings" w:char="F0E0"/>
+      </w:r>
+      <w:r>
+        <w:rPr>
+          <w:rFonts w:hint="eastAsia"/>
+        </w:rPr>
+        <w:t xml:space="preserve"> trigger </w:t>
+      </w:r>
+      <w:proofErr w:type="spellStart"/>
+      <w:r>
+        <w:t>Task_</w:t>
+      </w:r>
+      <w:r>
+        <w:rPr>
+          <w:rFonts w:hint="eastAsia"/>
+        </w:rPr>
+        <w:t>Dsp</w:t>
+      </w:r>
+      <w:r>
+        <w:t>AudioFrameProc</w:t>
+      </w:r>
+      <w:proofErr w:type="spellEnd"/>
+      <w:r>
+        <w:rPr>
+          <w:rFonts w:hint="eastAsia"/>
+        </w:rPr>
+        <w:t xml:space="preserve"> </w:t>
+      </w:r>
+      <w:r>
+        <w:sym w:font="Wingdings" w:char="F0E0"/>
+      </w:r>
+      <w:r>
+        <w:rPr>
+          <w:rFonts w:hint="eastAsia"/>
+        </w:rPr>
+        <w:t xml:space="preserve"> trigger </w:t>
+      </w:r>
+      <w:proofErr w:type="spellStart"/>
+      <w:r>
+        <w:t>Task_VitAndAudioDec</w:t>
+      </w:r>
+      <w:proofErr w:type="spellEnd"/>
+      <w:r>
+        <w:rPr>
+          <w:rFonts w:hint="eastAsia"/>
+        </w:rPr>
+        <w:tab/>
+      </w:r>
+    </w:p>
+    <w:p>
+      <w:pPr>
+        <w:rPr>
+          <w:rFonts w:hint="eastAsia"/>
+        </w:rPr>
+      </w:pPr>
+      <w:r>
+        <w:rPr>
+          <w:rFonts w:hint="eastAsia"/>
+        </w:rPr>
+        <w:tab/>
+      </w:r>
+      <w:r>
+        <w:rPr>
+          <w:rFonts w:hint="eastAsia"/>
+        </w:rPr>
+        <w:tab/>
+      </w:r>
+      <w:r>
+        <w:rPr>
+          <w:rFonts w:hint="eastAsia"/>
+        </w:rPr>
+        <w:tab/>
+      </w:r>
+      <w:r>
+        <w:rPr>
+          <w:rFonts w:hint="eastAsia"/>
+        </w:rPr>
+        <w:tab/>
+      </w:r>
+      <w:r>
+        <w:rPr>
+          <w:rFonts w:hint="eastAsia"/>
+        </w:rPr>
+        <w:tab/>
+      </w:r>
+      <w:r>
+        <w:rPr>
+          <w:rFonts w:hint="eastAsia"/>
+        </w:rPr>
+        <w:tab/>
+      </w:r>
+      <w:r>
+        <w:rPr>
+          <w:rFonts w:hint="eastAsia"/>
+        </w:rPr>
+        <w:tab/>
+      </w:r>
+      <w:r>
+        <w:rPr>
+          <w:rFonts w:hint="eastAsia"/>
+        </w:rPr>
+        <w:tab/>
+      </w:r>
+      <w:r>
+        <w:rPr>
+          <w:rFonts w:hint="eastAsia"/>
+        </w:rPr>
+        <w:tab/>
+      </w:r>
+      <w:r>
+        <w:rPr>
+          <w:rFonts w:hint="eastAsia"/>
+        </w:rPr>
+        <w:tab/>
+      </w:r>
+      <w:r>
+        <w:rPr>
+          <w:rFonts w:hint="eastAsia"/>
+        </w:rPr>
+        <w:tab/>
+      </w:r>
+      <w:r>
+        <w:rPr>
+          <w:rFonts w:hint="eastAsia"/>
+        </w:rPr>
+        <w:tab/>
+      </w:r>
+      <w:r>
+        <w:rPr>
+          <w:rFonts w:hint="eastAsia"/>
+        </w:rPr>
+        <w:tab/>
+      </w:r>
+      <w:r>
+        <w:rPr>
+          <w:rFonts w:hint="eastAsia"/>
+        </w:rPr>
+        <w:tab/>
+      </w:r>
+      <w:r>
+        <w:rPr>
+          <w:rFonts w:hint="eastAsia"/>
+        </w:rPr>
+        <w:tab/>
+      </w:r>
+      <w:r>
+        <w:rPr>
+          <w:rFonts w:hint="eastAsia"/>
+        </w:rPr>
+        <w:t>|</w:t>
+      </w:r>
+    </w:p>
+    <w:p>
+      <w:pPr>
+        <w:rPr>
+          <w:rFonts w:hint="eastAsia"/>
+        </w:rPr>
+      </w:pPr>
+      <w:r>
+        <w:rPr>
+          <w:rFonts w:hint="eastAsia"/>
+        </w:rPr>
+        <w:tab/>
+      </w:r>
+      <w:r>
+        <w:rPr>
+          <w:rFonts w:hint="eastAsia"/>
+        </w:rPr>
+        <w:tab/>
+      </w:r>
+      <w:r>
+        <w:rPr>
+          <w:rFonts w:hint="eastAsia"/>
+        </w:rPr>
+        <w:tab/>
+      </w:r>
+      <w:r>
+        <w:rPr>
+          <w:rFonts w:hint="eastAsia"/>
+        </w:rPr>
+        <w:tab/>
+      </w:r>
+      <w:r>
+        <w:rPr>
+          <w:rFonts w:hint="eastAsia"/>
+        </w:rPr>
+        <w:tab/>
+      </w:r>
+      <w:r>
+        <w:rPr>
+          <w:rFonts w:hint="eastAsia"/>
+        </w:rPr>
+        <w:tab/>
+      </w:r>
+      <w:r>
+        <w:rPr>
+          <w:rFonts w:hint="eastAsia"/>
+        </w:rPr>
+        <w:tab/>
+      </w:r>
+      <w:r>
+        <w:rPr>
+          <w:rFonts w:hint="eastAsia"/>
+        </w:rPr>
+        <w:tab/>
+      </w:r>
+      <w:r>
+        <w:rPr>
+          <w:rFonts w:hint="eastAsia"/>
+        </w:rPr>
+        <w:tab/>
+      </w:r>
+      <w:r>
+        <w:rPr>
+          <w:rFonts w:hint="eastAsia"/>
+        </w:rPr>
+        <w:tab/>
+      </w:r>
+      <w:r>
+        <w:rPr>
+          <w:rFonts w:hint="eastAsia"/>
+        </w:rPr>
+        <w:tab/>
+      </w:r>
+      <w:r>
+        <w:rPr>
+          <w:rFonts w:hint="eastAsia"/>
+        </w:rPr>
+        <w:tab/>
+      </w:r>
+      <w:r>
+        <w:rPr>
+          <w:rFonts w:hint="eastAsia"/>
+        </w:rPr>
+        <w:tab/>
+      </w:r>
+      <w:r>
+        <w:rPr>
+          <w:rFonts w:hint="eastAsia"/>
+        </w:rPr>
+        <w:tab/>
+      </w:r>
+      <w:r>
+        <w:rPr>
+          <w:rFonts w:hint="eastAsia"/>
+        </w:rPr>
+        <w:tab/>
+      </w:r>
+      <w:r>
+        <w:sym w:font="Wingdings" w:char="F0E0"/>
+      </w:r>
+      <w:r>
+        <w:rPr>
+          <w:rFonts w:hint="eastAsia"/>
+        </w:rPr>
+        <w:t xml:space="preserve"> </w:t>
+      </w:r>
+      <w:proofErr w:type="gramStart"/>
+      <w:r>
+        <w:rPr>
+          <w:rFonts w:hint="eastAsia"/>
+        </w:rPr>
+        <w:t>trigger</w:t>
+      </w:r>
+      <w:proofErr w:type="gramEnd"/>
+      <w:r>
+        <w:rPr>
+          <w:rFonts w:hint="eastAsia"/>
+        </w:rPr>
+        <w:t xml:space="preserve"> </w:t>
+      </w:r>
+      <w:proofErr w:type="spellStart"/>
+      <w:r>
+        <w:t>Task_AlgoContainerProc</w:t>
+      </w:r>
+      <w:proofErr w:type="spellEnd"/>
+      <w:r>
+        <w:sym w:font="Wingdings" w:char="F0E0"/>
+      </w:r>
+      <w:r>
+        <w:rPr>
+          <w:rFonts w:hint="eastAsia"/>
+        </w:rPr>
+        <w:tab/>
+      </w:r>
+      <w:r>
+        <w:rPr>
+          <w:rFonts w:hint="eastAsia"/>
+        </w:rPr>
+        <w:tab/>
+      </w:r>
+      <w:r>
+        <w:rPr>
+          <w:rFonts w:hint="eastAsia"/>
+        </w:rPr>
+        <w:tab/>
+      </w:r>
+      <w:r>
+        <w:rPr>
+          <w:rFonts w:hint="eastAsia"/>
+        </w:rPr>
+        <w:tab/>
+      </w:r>
+      <w:r>
+        <w:rPr>
+          <w:rFonts w:hint="eastAsia"/>
+        </w:rPr>
+        <w:tab/>
+      </w:r>
+      <w:r>
+        <w:rPr>
+          <w:rFonts w:hint="eastAsia"/>
+        </w:rPr>
+        <w:tab/>
+      </w:r>
+      <w:r>
+        <w:rPr>
+          <w:rFonts w:hint="eastAsia"/>
+        </w:rPr>
+        <w:tab/>
+      </w:r>
+      <w:r>
+        <w:rPr>
+          <w:rFonts w:hint="eastAsia"/>
+        </w:rPr>
+        <w:tab/>
+      </w:r>
+      <w:r>
+        <w:rPr>
+          <w:rFonts w:hint="eastAsia"/>
+        </w:rPr>
+        <w:tab/>
+      </w:r>
+      <w:r>
+        <w:rPr>
+          <w:rFonts w:hint="eastAsia"/>
+        </w:rPr>
+        <w:tab/>
+      </w:r>
+      <w:r>
+        <w:rPr>
+          <w:rFonts w:hint="eastAsia"/>
+        </w:rPr>
+        <w:tab/>
+      </w:r>
+      <w:r>
+        <w:rPr>
+          <w:rFonts w:hint="eastAsia"/>
+        </w:rPr>
+        <w:tab/>
+      </w:r>
+      <w:r>
+        <w:rPr>
+          <w:rFonts w:hint="eastAsia"/>
+        </w:rPr>
+        <w:tab/>
+      </w:r>
+      <w:r>
+        <w:rPr>
+          <w:rFonts w:hint="eastAsia"/>
+        </w:rPr>
+        <w:tab/>
+      </w:r>
+      <w:r>
+        <w:rPr>
+          <w:rFonts w:hint="eastAsia"/>
+        </w:rPr>
+        <w:tab/>
+      </w:r>
+      <w:r>
+        <w:rPr>
+          <w:rFonts w:hint="eastAsia"/>
+        </w:rPr>
+        <w:tab/>
+      </w:r>
+      <w:r>
+        <w:rPr>
+          <w:rFonts w:hint="eastAsia"/>
+        </w:rPr>
+        <w:tab/>
+      </w:r>
+      <w:r>
+        <w:rPr>
+          <w:rFonts w:hint="eastAsia"/>
+        </w:rPr>
+        <w:t xml:space="preserve">trigger </w:t>
+      </w:r>
+      <w:proofErr w:type="spellStart"/>
+      <w:r>
+        <w:rPr>
+          <w:rFonts w:hint="eastAsia"/>
+        </w:rPr>
+        <w:t>Mcu</w:t>
+      </w:r>
+      <w:proofErr w:type="spellEnd"/>
+      <w:r>
+        <w:rPr>
+          <w:rFonts w:hint="eastAsia"/>
+        </w:rPr>
+        <w:t xml:space="preserve"> MU</w:t>
+      </w:r>
+    </w:p>
+    <w:p>
+      <w:pPr>
+        <w:rPr>
+          <w:rFonts w:hint="eastAsia"/>
+        </w:rPr>
+      </w:pPr>
+    </w:p>
+    <w:p/>
+    <w:p/>
+    <w:p>
+      <w:pPr>
+        <w:rPr>
+          <w:rFonts w:hint="eastAsia"/>
+        </w:rPr>
+      </w:pPr>
+    </w:p>
+    <w:p>
+      <w:pPr>
+        <w:rPr>
+          <w:rFonts w:hint="eastAsia"/>
+        </w:rPr>
+      </w:pPr>
+    </w:p>
+    <w:p>
+      <w:pPr>
+        <w:rPr>
+          <w:rFonts w:hint="eastAsia"/>
+        </w:rPr>
+      </w:pPr>
+    </w:p>
+    <w:p>
+      <w:pPr>
+        <w:rPr>
+          <w:rFonts w:hint="eastAsia"/>
+        </w:rPr>
+      </w:pPr>
+    </w:p>
+    <w:p>
+      <w:pPr>
+        <w:rPr>
+          <w:rFonts w:hint="eastAsia"/>
+        </w:rPr>
+      </w:pPr>
+    </w:p>
+    <w:p>
+      <w:pPr>
+        <w:rPr>
+          <w:rFonts w:hint="eastAsia"/>
+        </w:rPr>
+      </w:pPr>
+    </w:p>
+    <w:p>
+      <w:pPr>
+        <w:rPr>
+          <w:rFonts w:hint="eastAsia"/>
+        </w:rPr>
+      </w:pPr>
+    </w:p>
+    <w:p>
+      <w:pPr>
+        <w:rPr>
+          <w:rFonts w:hint="eastAsia"/>
+        </w:rPr>
+      </w:pPr>
+    </w:p>
+    <w:p>
+      <w:pPr>
+        <w:rPr>
+          <w:rFonts w:hint="eastAsia"/>
+        </w:rPr>
+      </w:pPr>
+    </w:p>
+    <w:p>
+      <w:pPr>
+        <w:rPr>
+          <w:rFonts w:hint="eastAsia"/>
+        </w:rPr>
+      </w:pPr>
+    </w:p>
     <w:p/>
     <w:sectPr>
       <w:pgSz w:w="11906" w:h="16838"/>

</xml_diff>